<commit_message>
Remove cleanup column from maintainer brief comparison
Co-authored-by: Copilot <223556219+Copilot@users.noreply.github.com>
</commit_message>
<xml_diff>
--- a/ci-benchmark/matched-release/Rust-Compiler-Optimization-Maintainer-Brief.docx
+++ b/ci-benchmark/matched-release/Rust-Compiler-Optimization-Maintainer-Brief.docx
@@ -96,11 +96,10 @@
         <w:tblLook w:firstColumn="1" w:firstRow="1" w:lastColumn="0" w:lastRow="0" w:noHBand="0" w:noVBand="1" w:val="04A0"/>
       </w:tblPr>
       <w:tblGrid>
-        <w:gridCol w:w="4536"/>
-        <w:gridCol w:w="2160"/>
-        <w:gridCol w:w="2160"/>
-        <w:gridCol w:w="1656"/>
-        <w:gridCol w:w="1512"/>
+        <w:gridCol w:w="4896"/>
+        <w:gridCol w:w="2592"/>
+        <w:gridCol w:w="2592"/>
+        <w:gridCol w:w="1944"/>
         <w:gridCol w:w="3240"/>
       </w:tblGrid>
       <w:tr>
@@ -110,7 +109,7 @@
         </w:trPr>
         <w:tc>
           <w:tcPr>
-            <w:tcW w:type="dxa" w:w="4536"/>
+            <w:tcW w:type="dxa" w:w="4896"/>
           </w:tcPr>
           <w:p>
             <w:pPr>
@@ -126,7 +125,7 @@
         </w:tc>
         <w:tc>
           <w:tcPr>
-            <w:tcW w:type="dxa" w:w="2160"/>
+            <w:tcW w:type="dxa" w:w="2592"/>
           </w:tcPr>
           <w:p>
             <w:pPr>
@@ -144,7 +143,7 @@
         </w:tc>
         <w:tc>
           <w:tcPr>
-            <w:tcW w:type="dxa" w:w="2160"/>
+            <w:tcW w:type="dxa" w:w="2592"/>
           </w:tcPr>
           <w:p>
             <w:pPr>
@@ -162,25 +161,7 @@
         </w:tc>
         <w:tc>
           <w:tcPr>
-            <w:tcW w:type="dxa" w:w="1656"/>
-          </w:tcPr>
-          <w:p>
-            <w:pPr>
-              <w:spacing w:after="40" w:before="40"/>
-            </w:pPr>
-            <w:r>
-              <w:rPr>
-                <w:sz w:val="18"/>
-              </w:rPr>
-              <w:t>Cleanup min</w:t>
-              <w:br/>
-              <w:t>within job</w:t>
-            </w:r>
-          </w:p>
-        </w:tc>
-        <w:tc>
-          <w:tcPr>
-            <w:tcW w:type="dxa" w:w="1512"/>
+            <w:tcW w:type="dxa" w:w="1944"/>
           </w:tcPr>
           <w:p>
             <w:pPr>
@@ -219,7 +200,7 @@
         </w:trPr>
         <w:tc>
           <w:tcPr>
-            <w:tcW w:type="dxa" w:w="4536"/>
+            <w:tcW w:type="dxa" w:w="4896"/>
           </w:tcPr>
           <w:p>
             <w:pPr>
@@ -237,7 +218,7 @@
         </w:tc>
         <w:tc>
           <w:tcPr>
-            <w:tcW w:type="dxa" w:w="2160"/>
+            <w:tcW w:type="dxa" w:w="2592"/>
           </w:tcPr>
           <w:p>
             <w:pPr>
@@ -255,7 +236,7 @@
         </w:tc>
         <w:tc>
           <w:tcPr>
-            <w:tcW w:type="dxa" w:w="2160"/>
+            <w:tcW w:type="dxa" w:w="2592"/>
           </w:tcPr>
           <w:p>
             <w:pPr>
@@ -273,23 +254,7 @@
         </w:tc>
         <w:tc>
           <w:tcPr>
-            <w:tcW w:type="dxa" w:w="1656"/>
-          </w:tcPr>
-          <w:p>
-            <w:pPr>
-              <w:spacing w:after="40" w:before="40"/>
-            </w:pPr>
-            <w:r>
-              <w:rPr>
-                <w:sz w:val="18"/>
-              </w:rPr>
-              <w:t>0.0</w:t>
-            </w:r>
-          </w:p>
-        </w:tc>
-        <w:tc>
-          <w:tcPr>
-            <w:tcW w:type="dxa" w:w="1512"/>
+            <w:tcW w:type="dxa" w:w="1944"/>
           </w:tcPr>
           <w:p>
             <w:pPr>
@@ -326,7 +291,7 @@
         </w:trPr>
         <w:tc>
           <w:tcPr>
-            <w:tcW w:type="dxa" w:w="4536"/>
+            <w:tcW w:type="dxa" w:w="4896"/>
           </w:tcPr>
           <w:p>
             <w:pPr>
@@ -344,7 +309,7 @@
         </w:tc>
         <w:tc>
           <w:tcPr>
-            <w:tcW w:type="dxa" w:w="2160"/>
+            <w:tcW w:type="dxa" w:w="2592"/>
           </w:tcPr>
           <w:p>
             <w:pPr>
@@ -362,7 +327,7 @@
         </w:tc>
         <w:tc>
           <w:tcPr>
-            <w:tcW w:type="dxa" w:w="2160"/>
+            <w:tcW w:type="dxa" w:w="2592"/>
           </w:tcPr>
           <w:p>
             <w:pPr>
@@ -380,23 +345,7 @@
         </w:tc>
         <w:tc>
           <w:tcPr>
-            <w:tcW w:type="dxa" w:w="1656"/>
-          </w:tcPr>
-          <w:p>
-            <w:pPr>
-              <w:spacing w:after="40" w:before="40"/>
-            </w:pPr>
-            <w:r>
-              <w:rPr>
-                <w:sz w:val="18"/>
-              </w:rPr>
-              <w:t>10.5</w:t>
-            </w:r>
-          </w:p>
-        </w:tc>
-        <w:tc>
-          <w:tcPr>
-            <w:tcW w:type="dxa" w:w="1512"/>
+            <w:tcW w:type="dxa" w:w="1944"/>
           </w:tcPr>
           <w:p>
             <w:pPr>
@@ -433,7 +382,7 @@
         </w:trPr>
         <w:tc>
           <w:tcPr>
-            <w:tcW w:type="dxa" w:w="4536"/>
+            <w:tcW w:type="dxa" w:w="4896"/>
           </w:tcPr>
           <w:p>
             <w:pPr>
@@ -451,7 +400,7 @@
         </w:tc>
         <w:tc>
           <w:tcPr>
-            <w:tcW w:type="dxa" w:w="2160"/>
+            <w:tcW w:type="dxa" w:w="2592"/>
           </w:tcPr>
           <w:p>
             <w:pPr>
@@ -469,7 +418,7 @@
         </w:tc>
         <w:tc>
           <w:tcPr>
-            <w:tcW w:type="dxa" w:w="2160"/>
+            <w:tcW w:type="dxa" w:w="2592"/>
           </w:tcPr>
           <w:p>
             <w:pPr>
@@ -487,23 +436,7 @@
         </w:tc>
         <w:tc>
           <w:tcPr>
-            <w:tcW w:type="dxa" w:w="1656"/>
-          </w:tcPr>
-          <w:p>
-            <w:pPr>
-              <w:spacing w:after="40" w:before="40"/>
-            </w:pPr>
-            <w:r>
-              <w:rPr>
-                <w:sz w:val="18"/>
-              </w:rPr>
-              <w:t>10.6</w:t>
-            </w:r>
-          </w:p>
-        </w:tc>
-        <w:tc>
-          <w:tcPr>
-            <w:tcW w:type="dxa" w:w="1512"/>
+            <w:tcW w:type="dxa" w:w="1944"/>
           </w:tcPr>
           <w:p>
             <w:pPr>
@@ -540,7 +473,7 @@
         </w:trPr>
         <w:tc>
           <w:tcPr>
-            <w:tcW w:type="dxa" w:w="4536"/>
+            <w:tcW w:type="dxa" w:w="4896"/>
           </w:tcPr>
           <w:p>
             <w:pPr>
@@ -558,7 +491,7 @@
         </w:tc>
         <w:tc>
           <w:tcPr>
-            <w:tcW w:type="dxa" w:w="2160"/>
+            <w:tcW w:type="dxa" w:w="2592"/>
           </w:tcPr>
           <w:p>
             <w:pPr>
@@ -576,7 +509,7 @@
         </w:tc>
         <w:tc>
           <w:tcPr>
-            <w:tcW w:type="dxa" w:w="2160"/>
+            <w:tcW w:type="dxa" w:w="2592"/>
           </w:tcPr>
           <w:p>
             <w:pPr>
@@ -594,23 +527,7 @@
         </w:tc>
         <w:tc>
           <w:tcPr>
-            <w:tcW w:type="dxa" w:w="1656"/>
-          </w:tcPr>
-          <w:p>
-            <w:pPr>
-              <w:spacing w:after="40" w:before="40"/>
-            </w:pPr>
-            <w:r>
-              <w:rPr>
-                <w:sz w:val="18"/>
-              </w:rPr>
-              <w:t>0.0</w:t>
-            </w:r>
-          </w:p>
-        </w:tc>
-        <w:tc>
-          <w:tcPr>
-            <w:tcW w:type="dxa" w:w="1512"/>
+            <w:tcW w:type="dxa" w:w="1944"/>
           </w:tcPr>
           <w:p>
             <w:pPr>
@@ -647,7 +564,7 @@
         </w:trPr>
         <w:tc>
           <w:tcPr>
-            <w:tcW w:type="dxa" w:w="4536"/>
+            <w:tcW w:type="dxa" w:w="4896"/>
           </w:tcPr>
           <w:p>
             <w:pPr>
@@ -665,7 +582,7 @@
         </w:tc>
         <w:tc>
           <w:tcPr>
-            <w:tcW w:type="dxa" w:w="2160"/>
+            <w:tcW w:type="dxa" w:w="2592"/>
           </w:tcPr>
           <w:p>
             <w:pPr>
@@ -683,7 +600,7 @@
         </w:tc>
         <w:tc>
           <w:tcPr>
-            <w:tcW w:type="dxa" w:w="2160"/>
+            <w:tcW w:type="dxa" w:w="2592"/>
           </w:tcPr>
           <w:p>
             <w:pPr>
@@ -701,23 +618,7 @@
         </w:tc>
         <w:tc>
           <w:tcPr>
-            <w:tcW w:type="dxa" w:w="1656"/>
-          </w:tcPr>
-          <w:p>
-            <w:pPr>
-              <w:spacing w:after="40" w:before="40"/>
-            </w:pPr>
-            <w:r>
-              <w:rPr>
-                <w:sz w:val="18"/>
-              </w:rPr>
-              <w:t>2.3</w:t>
-            </w:r>
-          </w:p>
-        </w:tc>
-        <w:tc>
-          <w:tcPr>
-            <w:tcW w:type="dxa" w:w="1512"/>
+            <w:tcW w:type="dxa" w:w="1944"/>
           </w:tcPr>
           <w:p>
             <w:pPr>
@@ -754,7 +655,7 @@
         </w:trPr>
         <w:tc>
           <w:tcPr>
-            <w:tcW w:type="dxa" w:w="4536"/>
+            <w:tcW w:type="dxa" w:w="4896"/>
           </w:tcPr>
           <w:p>
             <w:pPr>
@@ -772,7 +673,7 @@
         </w:tc>
         <w:tc>
           <w:tcPr>
-            <w:tcW w:type="dxa" w:w="2160"/>
+            <w:tcW w:type="dxa" w:w="2592"/>
           </w:tcPr>
           <w:p>
             <w:pPr>
@@ -790,7 +691,7 @@
         </w:tc>
         <w:tc>
           <w:tcPr>
-            <w:tcW w:type="dxa" w:w="2160"/>
+            <w:tcW w:type="dxa" w:w="2592"/>
           </w:tcPr>
           <w:p>
             <w:pPr>
@@ -808,23 +709,7 @@
         </w:tc>
         <w:tc>
           <w:tcPr>
-            <w:tcW w:type="dxa" w:w="1656"/>
-          </w:tcPr>
-          <w:p>
-            <w:pPr>
-              <w:spacing w:after="40" w:before="40"/>
-            </w:pPr>
-            <w:r>
-              <w:rPr>
-                <w:sz w:val="18"/>
-              </w:rPr>
-              <w:t>2.6</w:t>
-            </w:r>
-          </w:p>
-        </w:tc>
-        <w:tc>
-          <w:tcPr>
-            <w:tcW w:type="dxa" w:w="1512"/>
+            <w:tcW w:type="dxa" w:w="1944"/>
           </w:tcPr>
           <w:p>
             <w:pPr>
@@ -861,7 +746,7 @@
         </w:trPr>
         <w:tc>
           <w:tcPr>
-            <w:tcW w:type="dxa" w:w="4536"/>
+            <w:tcW w:type="dxa" w:w="4896"/>
           </w:tcPr>
           <w:p>
             <w:pPr>
@@ -879,7 +764,7 @@
         </w:tc>
         <w:tc>
           <w:tcPr>
-            <w:tcW w:type="dxa" w:w="2160"/>
+            <w:tcW w:type="dxa" w:w="2592"/>
           </w:tcPr>
           <w:p>
             <w:pPr>
@@ -897,7 +782,7 @@
         </w:tc>
         <w:tc>
           <w:tcPr>
-            <w:tcW w:type="dxa" w:w="2160"/>
+            <w:tcW w:type="dxa" w:w="2592"/>
           </w:tcPr>
           <w:p>
             <w:pPr>
@@ -915,23 +800,7 @@
         </w:tc>
         <w:tc>
           <w:tcPr>
-            <w:tcW w:type="dxa" w:w="1656"/>
-          </w:tcPr>
-          <w:p>
-            <w:pPr>
-              <w:spacing w:after="40" w:before="40"/>
-            </w:pPr>
-            <w:r>
-              <w:rPr>
-                <w:sz w:val="18"/>
-              </w:rPr>
-              <w:t>0.0</w:t>
-            </w:r>
-          </w:p>
-        </w:tc>
-        <w:tc>
-          <w:tcPr>
-            <w:tcW w:type="dxa" w:w="1512"/>
+            <w:tcW w:type="dxa" w:w="1944"/>
           </w:tcPr>
           <w:p>
             <w:pPr>
@@ -968,7 +837,7 @@
         </w:trPr>
         <w:tc>
           <w:tcPr>
-            <w:tcW w:type="dxa" w:w="4536"/>
+            <w:tcW w:type="dxa" w:w="4896"/>
           </w:tcPr>
           <w:p>
             <w:pPr>
@@ -986,7 +855,7 @@
         </w:tc>
         <w:tc>
           <w:tcPr>
-            <w:tcW w:type="dxa" w:w="2160"/>
+            <w:tcW w:type="dxa" w:w="2592"/>
           </w:tcPr>
           <w:p>
             <w:pPr>
@@ -1004,7 +873,7 @@
         </w:tc>
         <w:tc>
           <w:tcPr>
-            <w:tcW w:type="dxa" w:w="2160"/>
+            <w:tcW w:type="dxa" w:w="2592"/>
           </w:tcPr>
           <w:p>
             <w:pPr>
@@ -1022,23 +891,7 @@
         </w:tc>
         <w:tc>
           <w:tcPr>
-            <w:tcW w:type="dxa" w:w="1656"/>
-          </w:tcPr>
-          <w:p>
-            <w:pPr>
-              <w:spacing w:after="40" w:before="40"/>
-            </w:pPr>
-            <w:r>
-              <w:rPr>
-                <w:sz w:val="18"/>
-              </w:rPr>
-              <w:t>3.6</w:t>
-            </w:r>
-          </w:p>
-        </w:tc>
-        <w:tc>
-          <w:tcPr>
-            <w:tcW w:type="dxa" w:w="1512"/>
+            <w:tcW w:type="dxa" w:w="1944"/>
           </w:tcPr>
           <w:p>
             <w:pPr>
@@ -1075,7 +928,7 @@
         </w:trPr>
         <w:tc>
           <w:tcPr>
-            <w:tcW w:type="dxa" w:w="4536"/>
+            <w:tcW w:type="dxa" w:w="4896"/>
           </w:tcPr>
           <w:p>
             <w:pPr>
@@ -1093,7 +946,7 @@
         </w:tc>
         <w:tc>
           <w:tcPr>
-            <w:tcW w:type="dxa" w:w="2160"/>
+            <w:tcW w:type="dxa" w:w="2592"/>
           </w:tcPr>
           <w:p>
             <w:pPr>
@@ -1111,7 +964,7 @@
         </w:tc>
         <w:tc>
           <w:tcPr>
-            <w:tcW w:type="dxa" w:w="2160"/>
+            <w:tcW w:type="dxa" w:w="2592"/>
           </w:tcPr>
           <w:p>
             <w:pPr>
@@ -1129,23 +982,7 @@
         </w:tc>
         <w:tc>
           <w:tcPr>
-            <w:tcW w:type="dxa" w:w="1656"/>
-          </w:tcPr>
-          <w:p>
-            <w:pPr>
-              <w:spacing w:after="40" w:before="40"/>
-            </w:pPr>
-            <w:r>
-              <w:rPr>
-                <w:sz w:val="18"/>
-              </w:rPr>
-              <w:t>4.0</w:t>
-            </w:r>
-          </w:p>
-        </w:tc>
-        <w:tc>
-          <w:tcPr>
-            <w:tcW w:type="dxa" w:w="1512"/>
+            <w:tcW w:type="dxa" w:w="1944"/>
           </w:tcPr>
           <w:p>
             <w:pPr>

</xml_diff>